<commit_message>
feat: secure order access and legal consent evidence
</commit_message>
<xml_diff>
--- a/docs/legal/docx/01-personal-data-policy.docx
+++ b/docs/legal/docx/01-personal-data-policy.docx
@@ -30,7 +30,7 @@
         <w:t>Редакция:</w:t>
       </w:r>
       <w:r>
-        <w:t xml:space="preserve"> 1.0 от 31 июля 2026 года</w:t>
+        <w:t xml:space="preserve"> 3.0 от 18 августа 2026 года</w:t>
       </w:r>
     </w:p>
     <w:p>
@@ -52,29 +52,29 @@
         <w:t>Оператор:</w:t>
       </w:r>
       <w:r>
-        <w:t xml:space="preserve"> Абдулкадыров Дук-Ваха Магомедович, адрес: ул. Т. Л. Алиева, 69 [УКАЗАТЬ ИНДЕКС, НАСЕЛЁННЫЙ ПУНКТ, РЕГИОН], email: studiacatalog@outlook.com</w:t>
+        <w:t xml:space="preserve"> Абдулкадыров Дук-Ваха Магомедович, плательщик НПД, ИНН 200600136496, дата постановки на учёт 05.08.2026</w:t>
       </w:r>
     </w:p>
     <w:p>
-      <w:pPr>
-        <w:spacing w:before="120" w:after="160"/>
-        <w:ind w:left="255" w:right="113"/>
-      </w:pPr>
       <w:r>
         <w:rPr>
-          <w:color w:val="8B5500"/>
+          <w:b/>
         </w:rPr>
-        <w:t xml:space="preserve">Рабочий проект. До публикации необходимо удалить все метки </w:t>
+        <w:t>Адрес:</w:t>
       </w:r>
       <w:r>
+        <w:t xml:space="preserve"> Чеченская Республика, Курчалоевский район, село Цоци-Юрт, улица Т. Л. Алиева, дом 69</w:t>
+      </w:r>
+    </w:p>
+    <w:p>
+      <w:r>
         <w:rPr>
-          <w:rFonts w:ascii="Courier New" w:hAnsi="Courier New"/>
-          <w:sz w:val="18"/>
+          <w:b/>
         </w:rPr>
-        <w:t>[ЗАПОЛНИТЬ]</w:t>
+        <w:t>Контакты:</w:t>
       </w:r>
       <w:r>
-        <w:t>, подтвердить российскую инфраструктуру и получить проверку российского юриста.</w:t>
+        <w:t xml:space="preserve"> support@wayyaam.ru; вопросы персональных данных: privacy@wayyaam.ru; +7 928 886-54-70</w:t>
       </w:r>
     </w:p>
     <w:p>
@@ -734,31 +734,17 @@
     </w:p>
     <w:p>
       <w:r>
-        <w:t xml:space="preserve">Данные заказа предоставляются соответствующему ресторану, назначенному водителю и уполномоченной поддержке в минимальном объёме и на нужный срок. Основная БД, Auth, файловое хранилище и резервные копии должны находиться в России: </w:t>
-      </w:r>
-      <w:r>
-        <w:rPr>
-          <w:b/>
-        </w:rPr>
-        <w:t>поставщик, адрес ЦОД и договор - `[ЗАПОЛНИТЬ]`</w:t>
-      </w:r>
-      <w:r>
-        <w:t>.</w:t>
+        <w:t>Данные заказа предоставляются только выбранному бизнесу, назначенному водителю и уполномоченной поддержке в минимальном объёме и на нужный срок. Клиент видит собственный заказ, контакты бизнеса и данные назначенного водителя; бизнес — только свои заказы; водитель — только фактически назначенную ему активную доставку. Идентификатор заказа сам по себе не даёт доступа. Для гостевого заказа используется отдельный секретный токен, в базе хранится только его хеш.</w:t>
       </w:r>
     </w:p>
     <w:p>
       <w:r>
-        <w:t xml:space="preserve">Фактический код содержит обращения к WhatsApp/Meta, Nominatim/OpenStreetMap, public OSRM, OSM/Esri tiles, browser push providers и GitHub Pages. До законного запуска каждый иностранный поток должен быть отключён или пройти оценку получателя и отдельную предварительную процедуру трансграничной передачи. Текущий Supabase </w:t>
+        <w:t>Основная БД, Auth, файловое хранилище и приложение Supabase размещены на VPS ООО «Бегет» в Российской Федерации: дата-центр DataLine, г. Санкт-Петербург, территория ЦОД, ул. Жукова, д. 43, стр. 2. Услуги ЦОД ООО «Бегет» предоставляет АО «СЕВЕРЕН-ТЕЛЕКОМ». Резервные копии VPS находятся в том же российском ЦОД. ООО «Бегет» предоставляет VPS/хостинг и root-доступ, но не принимает на себя функции оператора персональных данных WayYaam.</w:t>
       </w:r>
+    </w:p>
+    <w:p>
       <w:r>
-        <w:rPr>
-          <w:rFonts w:ascii="Courier New" w:hAnsi="Courier New"/>
-          <w:sz w:val="18"/>
-        </w:rPr>
-        <w:t>eu-west-2</w:t>
-      </w:r>
-      <w:r>
-        <w:t xml:space="preserve"> нельзя использовать для первичной базы граждан РФ.</w:t>
+        <w:t>В интерфейсе могут использоваться внешние картографические, push- и коммуникационные сервисы. Передача им данных ограничивается функцией, выбранной пользователем; состав, получатель и основание каждого потока учитываются оператором отдельно. Первичная запись данных аккаунтов и заказов выполняется в указанной российской инфраструктуре.</w:t>
       </w:r>
     </w:p>
     <w:p>
@@ -776,7 +762,7 @@
     </w:p>
     <w:p>
       <w:r>
-        <w:t>Клиент передаёт точку только явным действием либо выбирает адрес вручную. Водитель передаёт геолокацию только при включённом статусе online и/или активной доставке; приложение показывает индикатор и прекращает сбор после выхода offline. Точная точка доступна только участникам конкретной доставки. После срока разрешения споров она удаляется или обезличивается.</w:t>
+        <w:t>Клиент передаёт точку только явным действием либо выбирает адрес вручную. Водитель передаёт геолокацию только при включённом статусе online и/или активной доставке; приложение показывает индикатор и прекращает сбор после выхода offline. Точная текущая точка назначенного водителя доступна только клиенту, бизнесу, самому назначенному водителю и уполномоченной поддержке в период активной доставки. После завершения или отмены live-доступ прекращается для всех рабочих интерфейсов; водитель больше не получает контакты и координаты клиента.</w:t>
       </w:r>
     </w:p>
     <w:p>
@@ -1036,14 +1022,7 @@
           </w:tcPr>
           <w:p>
             <w:r>
-              <w:t xml:space="preserve">оперативно на срок доставки; детальная история </w:t>
-            </w:r>
-            <w:r>
-              <w:rPr>
-                <w:rFonts w:ascii="Courier New" w:hAnsi="Courier New"/>
-                <w:sz w:val="18"/>
-              </w:rPr>
-              <w:t>[ЗАПОЛНИТЬ, рекомендуется минимальный срок]</w:t>
+              <w:t>live-доступ только на срок активной доставки; после завершения текущая точка не выдаётся, а ограниченные технические события хранятся до 12 месяцев для безопасности и споров</w:t>
             </w:r>
           </w:p>
         </w:tc>
@@ -1080,14 +1059,7 @@
           </w:tcPr>
           <w:p>
             <w:r>
-              <w:t xml:space="preserve">срок претензий и обязательного бухгалтерского/налогового хранения, точно </w:t>
-            </w:r>
-            <w:r>
-              <w:rPr>
-                <w:rFonts w:ascii="Courier New" w:hAnsi="Courier New"/>
-                <w:sz w:val="18"/>
-              </w:rPr>
-              <w:t>[ЗАПОЛНИТЬ С ЮРИСТОМ]</w:t>
+              <w:t>5 лет после завершения расчётного года либо дольше, если конкретный законный спор или обязательный срок этого требует</w:t>
             </w:r>
           </w:p>
         </w:tc>
@@ -1124,7 +1096,7 @@
           </w:tcPr>
           <w:p>
             <w:r>
-              <w:t>для доказательства ответа/основания в пределах применимых сроков требований</w:t>
+              <w:t>3 года после закрытия обращения; доказательства договора и согласий — вместе с относящимся к ним заказом/отношением и в пределах применимого срока требований</w:t>
             </w:r>
           </w:p>
         </w:tc>
@@ -1161,14 +1133,7 @@
           </w:tcPr>
           <w:p>
             <w:r>
-              <w:rPr>
-                <w:rFonts w:ascii="Courier New" w:hAnsi="Courier New"/>
-                <w:sz w:val="18"/>
-              </w:rPr>
-              <w:t>[ЗАПОЛНИТЬ, например 12 месяцев]</w:t>
-            </w:r>
-            <w:r>
-              <w:t>, с минимизацией payload</w:t>
+              <w:t>до 12 месяцев с минимизацией payload и без записи гостевых tracking-токенов</w:t>
             </w:r>
           </w:p>
         </w:tc>
@@ -1205,14 +1170,7 @@
           </w:tcPr>
           <w:p>
             <w:r>
-              <w:rPr>
-                <w:rFonts w:ascii="Courier New" w:hAnsi="Courier New"/>
-                <w:sz w:val="18"/>
-              </w:rPr>
-              <w:t>[ЗАПОЛНИТЬ TTL]</w:t>
-            </w:r>
-            <w:r>
-              <w:t>; удалённые данные исчезают после ротации, доступ блокируется сразу</w:t>
+              <w:t>операторская ежедневная копия в 03:20 МСК со случайной задержкой до 15 минут; ротация 14 дней; копии находятся на том же VPS в российском ЦОД</w:t>
             </w:r>
           </w:p>
         </w:tc>
@@ -1240,7 +1198,7 @@
           <w:rFonts w:ascii="Courier New" w:hAnsi="Courier New"/>
           <w:sz w:val="18"/>
         </w:rPr>
-        <w:t>{EMAIL}</w:t>
+        <w:t>privacy@wayyaam.ru</w:t>
       </w:r>
       <w:r>
         <w:t xml:space="preserve"> с достаточной для идентификации информацией. Копию паспорта нельзя требовать автоматически: оператор использует минимально необходимый способ проверки.</w:t>
@@ -1255,7 +1213,7 @@
           <w:rFonts w:ascii="Courier New" w:hAnsi="Courier New"/>
           <w:sz w:val="18"/>
         </w:rPr>
-        <w:t>{EMAIL}</w:t>
+        <w:t>privacy@wayyaam.ru</w:t>
       </w:r>
       <w:r>
         <w:t>; оператор подтверждает получение, проверяет личность, прекращает необязательную обработку, удаляет/блокирует данные и сообщает результат. Отказ объясняется со ссылкой на законное основание и срок хранения.</w:t>
@@ -1271,7 +1229,7 @@
     </w:p>
     <w:p>
       <w:r>
-        <w:t>Оператор назначает ответственного, ведёт реестр систем и доступов, применяет RLS/least privilege, MFA для привилегированных ролей, шифрование, резервирование, журналирование, обучение и проверку подрядчиков. При инциденте действует утверждённый регламент, включая первичное уведомление Роскомнадзора в течение 24 часов и результаты расследования в течение 72 часов, когда применимо.</w:t>
+        <w:t>Ответственным за организацию обработки является сам оператор — Абдулкадыров Дук-Ваха Магомедович. Оператор ведёт реестр систем и доступов, применяет RLS и минимальные привилегии, защищённые каналы, резервирование, журналирование и контроль подрядчиков. В панели хостинга журналируются действия; основная инфраструктура использует firewall, дата-центр имеет бесперебойное питание. ООО «Бегет» не заявляет для клиентской инфраструктуры WayYaam аттестацию ФСТЭК, собственные СЗКИ или отдельную защиту сайта от DDoS, поэтому такие меры не декларируются как предоставленные хостером. При инциденте действует утверждённый регламент, включая обязательные уведомления в применимых случаях.</w:t>
       </w:r>
     </w:p>
     <w:p>
@@ -1297,14 +1255,14 @@
     </w:p>
     <w:p>
       <w:r>
-        <w:t xml:space="preserve">Существенные новые цели или получатели не применяются задним числом без надлежащего основания и информирования. Актуальная версия доступна на </w:t>
+        <w:t xml:space="preserve">Дата начала обработки персональных данных — 25.08.2026. Обработка прекращается при прекращении деятельности платформы WayYaam и завершении обязательных сроков хранения, а по отдельной цели — также при достижении цели и отсутствии иного законного основания. Существенные новые цели или получатели не применяются задним числом без надлежащего основания и информирования. Актуальная версия доступна на </w:t>
       </w:r>
       <w:r>
         <w:rPr>
           <w:rFonts w:ascii="Courier New" w:hAnsi="Courier New"/>
           <w:sz w:val="18"/>
         </w:rPr>
-        <w:t>{DOMAIN}</w:t>
+        <w:t>wayyaam.ru</w:t>
       </w:r>
       <w:r>
         <w:t xml:space="preserve">. Вопросы: </w:t>
@@ -1314,7 +1272,7 @@
           <w:rFonts w:ascii="Courier New" w:hAnsi="Courier New"/>
           <w:sz w:val="18"/>
         </w:rPr>
-        <w:t>{EMAIL}</w:t>
+        <w:t>privacy@wayyaam.ru</w:t>
       </w:r>
       <w:r>
         <w:t>. Надзорный орган - Федеральная служба по надзору в сфере связи, информационных технологий и массовых коммуникаций.</w:t>
@@ -1342,7 +1300,7 @@
       <w:rPr>
         <w:sz w:val="16"/>
       </w:rPr>
-      <w:t>WayYaam · 1.0 · studiacatalog@outlook.com</w:t>
+      <w:t>WayYaam · 3.0 · privacy@wayyaam.ru</w:t>
     </w:r>
   </w:p>
 </w:ftr>
@@ -1712,11 +1670,11 @@
     <w:qFormat/>
     <w:rsid w:val="00FC693F"/>
     <w:pPr>
-      <w:spacing w:after="120" w:line="264" w:lineRule="auto"/>
+      <w:spacing w:after="100" w:line="252" w:lineRule="auto"/>
     </w:pPr>
     <w:rPr>
       <w:rFonts w:ascii="Arial" w:hAnsi="Arial"/>
-      <w:sz w:val="21"/>
+      <w:sz w:val="20"/>
     </w:rPr>
   </w:style>
   <w:style w:type="paragraph" w:styleId="Header">

</xml_diff>